<commit_message>
docs: replace pz_corrections.docx with plain format
https://claude.ai/code/session_01D3hkvTwHu9An1jnGPvHyaS
</commit_message>
<xml_diff>
--- a/docs/pz_corrections.docx
+++ b/docs/pz_corrections.docx
@@ -4,25 +4,35 @@
   <w:body>
     <w:p>
       <w:pPr>
-        <w:pStyle w:val="Title"/>
         <w:jc w:val="center"/>
       </w:pPr>
       <w:r>
-        <w:t>Перечень исправлений к пояснительной записке</w:t>
+        <w:rPr>
+          <w:b/>
+          <w:sz w:val="28"/>
+        </w:rPr>
+        <w:t>Исправления к пояснительной записке</w:t>
+      </w:r>
+    </w:p>
+    <w:p/>
+    <w:p>
+      <w:r>
+        <w:rPr>
+          <w:b/>
+          <w:sz w:val="24"/>
+        </w:rPr>
+        <w:t>Исправление 1</w:t>
       </w:r>
     </w:p>
     <w:p>
       <w:r>
-        <w:t>Документ содержит 6 исправлений. Для каждого подпункта указаны: место в ПЗ, причина ошибки, исходный текст и полностью исправленный текст подпункта.</w:t>
+        <w:rPr>
+          <w:b/>
+        </w:rPr>
+        <w:t xml:space="preserve">Место: </w:t>
       </w:r>
-    </w:p>
-    <w:p/>
-    <w:p>
-      <w:pPr>
-        <w:pStyle w:val="Heading1"/>
-      </w:pPr>
       <w:r>
-        <w:t>Исправление 1. Аннотация [абзац 3]</w:t>
+        <w:t>Аннотация, абзац 3</w:t>
       </w:r>
     </w:p>
     <w:p>
@@ -33,7 +43,7 @@
         <w:t xml:space="preserve">Причина: </w:t>
       </w:r>
       <w:r>
-        <w:t>Фактическая ошибка: test_integration.py содержит 51 тест, test_unit.py — 17. Итого 68, а не 39.</w:t>
+        <w:t>Фактическая ошибка: test_integration.py содержит 51 тест, test_unit.py — 17, итого 68.</w:t>
       </w:r>
     </w:p>
     <w:p>
@@ -41,17 +51,11 @@
         <w:rPr>
           <w:b/>
         </w:rPr>
-        <w:t>Исходный текст:</w:t>
+        <w:t>Было:</w:t>
       </w:r>
     </w:p>
     <w:p>
-      <w:pPr>
-        <w:ind w:left="480"/>
-      </w:pPr>
       <w:r>
-        <w:rPr>
-          <w:color w:val="A00000"/>
-        </w:rPr>
         <w:t>Бэкенд реализован на Django 5 и Django REST Framework, фронтенд — на React 19 с TypeScript. Написано 39 автоматических тестов для API и бизнес-логики. Приложение развёрнуто на VPS-сервере под управлением Debian 11.</w:t>
       </w:r>
     </w:p>
@@ -60,27 +64,33 @@
         <w:rPr>
           <w:b/>
         </w:rPr>
-        <w:t>Исправленный текст:</w:t>
+        <w:t>Стало:</w:t>
       </w:r>
     </w:p>
     <w:p>
-      <w:pPr>
-        <w:ind w:left="480"/>
-      </w:pPr>
       <w:r>
-        <w:rPr>
-          <w:color w:val="006000"/>
-        </w:rPr>
         <w:t>Бэкенд реализован на Django 5 и Django REST Framework, фронтенд — на React 19 с TypeScript. Написано 68 автоматических тестов для API и бизнес-логики. Приложение развёрнуто на VPS-сервере под управлением Debian 11.</w:t>
       </w:r>
     </w:p>
     <w:p/>
     <w:p>
-      <w:pPr>
-        <w:pStyle w:val="Heading1"/>
-      </w:pPr>
       <w:r>
-        <w:t>Исправление 2. 1.3.3 Описание структуры входных и выходных данных — перечень полей bootstrap</w:t>
+        <w:rPr>
+          <w:b/>
+          <w:sz w:val="24"/>
+        </w:rPr>
+        <w:t>Исправление 2</w:t>
+      </w:r>
+    </w:p>
+    <w:p>
+      <w:r>
+        <w:rPr>
+          <w:b/>
+        </w:rPr>
+        <w:t xml:space="preserve">Место: </w:t>
+      </w:r>
+      <w:r>
+        <w:t>1.3.3 Описание структуры входных и выходных данных — поле links</w:t>
       </w:r>
     </w:p>
     <w:p>
@@ -91,7 +101,7 @@
         <w:t xml:space="preserve">Причина: </w:t>
       </w:r>
       <w:r>
-        <w:t>Кодовое расхождение: BootstrapView возвращает 4 ключа в links, в тексте указаны только 2.</w:t>
+        <w:t>Кодовое расхождение: BootstrapView возвращает 4 ключа в объекте links, в тексте перечислены только 2.</w:t>
       </w:r>
     </w:p>
     <w:p>
@@ -99,17 +109,11 @@
         <w:rPr>
           <w:b/>
         </w:rPr>
-        <w:t>Исходный текст:</w:t>
+        <w:t>Было:</w:t>
       </w:r>
     </w:p>
     <w:p>
-      <w:pPr>
-        <w:ind w:left="480"/>
-      </w:pPr>
       <w:r>
-        <w:rPr>
-          <w:color w:val="A00000"/>
-        </w:rPr>
         <w:t>– links — объект с внешними ссылками (vkCommunity, vkMessages);</w:t>
       </w:r>
     </w:p>
@@ -118,27 +122,33 @@
         <w:rPr>
           <w:b/>
         </w:rPr>
-        <w:t>Исправленный текст:</w:t>
+        <w:t>Стало:</w:t>
       </w:r>
     </w:p>
     <w:p>
-      <w:pPr>
-        <w:ind w:left="480"/>
-      </w:pPr>
       <w:r>
-        <w:rPr>
-          <w:color w:val="006000"/>
-        </w:rPr>
         <w:t>– links — объект с внешними ссылками (vkCommunity, vkMessages, telegramOrder, telegramPublic);</w:t>
       </w:r>
     </w:p>
     <w:p/>
     <w:p>
-      <w:pPr>
-        <w:pStyle w:val="Heading1"/>
-      </w:pPr>
       <w:r>
-        <w:t>Исправление 3. 2.1.3 Реализация интерфейса — ViewMode</w:t>
+        <w:rPr>
+          <w:b/>
+          <w:sz w:val="24"/>
+        </w:rPr>
+        <w:t>Исправление 3</w:t>
+      </w:r>
+    </w:p>
+    <w:p>
+      <w:r>
+        <w:rPr>
+          <w:b/>
+        </w:rPr>
+        <w:t xml:space="preserve">Место: </w:t>
+      </w:r>
+      <w:r>
+        <w:t>2.1.3 Реализация интерфейса — тип ViewMode</w:t>
       </w:r>
     </w:p>
     <w:p>
@@ -149,7 +159,7 @@
         <w:t xml:space="preserve">Причина: </w:t>
       </w:r>
       <w:r>
-        <w:t>Кодовое расхождение: types.ts содержит 8 значений ViewMode, в тексте перечислено 6; также уточнено поведение навигации.</w:t>
+        <w:t>Кодовое расхождение: в types.ts определено 8 значений ViewMode, в тексте перечислено 6 — пропущены privacy и login.</w:t>
       </w:r>
     </w:p>
     <w:p>
@@ -157,17 +167,11 @@
         <w:rPr>
           <w:b/>
         </w:rPr>
-        <w:t>Исходный текст:</w:t>
+        <w:t>Было:</w:t>
       </w:r>
     </w:p>
     <w:p>
-      <w:pPr>
-        <w:ind w:left="480"/>
-      </w:pPr>
       <w:r>
-        <w:rPr>
-          <w:color w:val="A00000"/>
-        </w:rPr>
         <w:t>Навигация реализована через переключение состояния currentView (тип ViewMode: home | catalog | sets | services | reviews | admin). Роутер отсутствует — это обоснованно для приложения без прямых ссылок на внутренние страницы.</w:t>
       </w:r>
     </w:p>
@@ -176,27 +180,33 @@
         <w:rPr>
           <w:b/>
         </w:rPr>
-        <w:t>Исправленный текст:</w:t>
+        <w:t>Стало:</w:t>
       </w:r>
     </w:p>
     <w:p>
-      <w:pPr>
-        <w:ind w:left="480"/>
-      </w:pPr>
       <w:r>
-        <w:rPr>
-          <w:color w:val="006000"/>
-        </w:rPr>
         <w:t>Навигация реализована через переключение состояния currentView (тип ViewMode: home | catalog | sets | services | reviews | privacy | admin | login). Браузерный роутер не используется: переходы между разделами обслуживаются History API (pushState / popstate), что обеспечивает корректную работу кнопок «Назад» и «Вперёд» без полной перезагрузки страницы.</w:t>
       </w:r>
     </w:p>
     <w:p/>
     <w:p>
-      <w:pPr>
-        <w:pStyle w:val="Heading1"/>
-      </w:pPr>
       <w:r>
-        <w:t>Исправление 4. 2.1.3 Реализация интерфейса — вкладки WorkshopPanel</w:t>
+        <w:rPr>
+          <w:b/>
+          <w:sz w:val="24"/>
+        </w:rPr>
+        <w:t>Исправление 4</w:t>
+      </w:r>
+    </w:p>
+    <w:p>
+      <w:r>
+        <w:rPr>
+          <w:b/>
+        </w:rPr>
+        <w:t xml:space="preserve">Место: </w:t>
+      </w:r>
+      <w:r>
+        <w:t>2.1.3 Реализация интерфейса — вкладки WorkshopPanel</w:t>
       </w:r>
     </w:p>
     <w:p>
@@ -207,7 +217,7 @@
         <w:t xml:space="preserve">Причина: </w:t>
       </w:r>
       <w:r>
-        <w:t>Два нарушения: (1) порядок вкладок в коде — Каталог стоит перед Комплектами, а не после; (2) не указано, что Допуски видны только при isSuperuser === true.</w:t>
+        <w:t>Два нарушения: (1) в коде Каталог стоит перед Комплектами, а не после; (2) не указано, что вкладка Допуски видна только при isSuperuser === true.</w:t>
       </w:r>
     </w:p>
     <w:p>
@@ -215,17 +225,11 @@
         <w:rPr>
           <w:b/>
         </w:rPr>
-        <w:t>Исходный текст:</w:t>
+        <w:t>Было:</w:t>
       </w:r>
     </w:p>
     <w:p>
-      <w:pPr>
-        <w:ind w:left="480"/>
-      </w:pPr>
       <w:r>
-        <w:rPr>
-          <w:color w:val="A00000"/>
-        </w:rPr>
         <w:t>Компонент WorkshopPanel реализует панель управления с восемью вкладками: Сводка, Заказы, Задачи, Клиенты, Допуски, Комплекты, Каталог, Отзывы. Каждая вкладка содержит собственную логику загрузки данных через функцию apiFetch.</w:t>
       </w:r>
     </w:p>
@@ -234,27 +238,33 @@
         <w:rPr>
           <w:b/>
         </w:rPr>
-        <w:t>Исправленный текст:</w:t>
+        <w:t>Стало:</w:t>
       </w:r>
     </w:p>
     <w:p>
-      <w:pPr>
-        <w:ind w:left="480"/>
-      </w:pPr>
       <w:r>
-        <w:rPr>
-          <w:color w:val="006000"/>
-        </w:rPr>
-        <w:t>Компонент WorkshopPanel реализует панель управления с восемью вкладками: Сводка, Заказы, Задачи, Клиенты, Каталог, Комплекты, Отзывы и Допуски (последняя доступна только суперпользователю). Каждая вкладка содержит собственную логику загрузки данных через функцию apiFetch.</w:t>
+        <w:t>Компонент WorkshopPanel реализует панель управления с восемью вкладками: Сводка, Заказы, Задачи, Клиенты, Каталог, Комплекты, Отзывы и Допуски (последняя отображается только суперпользователю). Каждая вкладка содержит собственную логику загрузки данных через функцию apiFetch.</w:t>
       </w:r>
     </w:p>
     <w:p/>
     <w:p>
-      <w:pPr>
-        <w:pStyle w:val="Heading1"/>
-      </w:pPr>
       <w:r>
-        <w:t>Исправление 5. 2.2 Тестирование — итоговая строка</w:t>
+        <w:rPr>
+          <w:b/>
+          <w:sz w:val="24"/>
+        </w:rPr>
+        <w:t>Исправление 5</w:t>
+      </w:r>
+    </w:p>
+    <w:p>
+      <w:r>
+        <w:rPr>
+          <w:b/>
+        </w:rPr>
+        <w:t xml:space="preserve">Место: </w:t>
+      </w:r>
+      <w:r>
+        <w:t>2.2 Тестирование — итоговая строка</w:t>
       </w:r>
     </w:p>
     <w:p>
@@ -273,17 +283,11 @@
         <w:rPr>
           <w:b/>
         </w:rPr>
-        <w:t>Исходный текст:</w:t>
+        <w:t>Было:</w:t>
       </w:r>
     </w:p>
     <w:p>
-      <w:pPr>
-        <w:ind w:left="480"/>
-      </w:pPr>
       <w:r>
-        <w:rPr>
-          <w:color w:val="A00000"/>
-        </w:rPr>
         <w:t>Все 39 тестов проходят успешно. Время выполнения полного набора тестов составляет 1,8 секунды.</w:t>
       </w:r>
     </w:p>
@@ -292,27 +296,33 @@
         <w:rPr>
           <w:b/>
         </w:rPr>
-        <w:t>Исправленный текст:</w:t>
+        <w:t>Стало:</w:t>
       </w:r>
     </w:p>
     <w:p>
-      <w:pPr>
-        <w:ind w:left="480"/>
-      </w:pPr>
       <w:r>
-        <w:rPr>
-          <w:color w:val="006000"/>
-        </w:rPr>
         <w:t>Все 68 тестов проходят успешно. Время выполнения полного набора тестов составляет около 2 секунд.</w:t>
       </w:r>
     </w:p>
     <w:p/>
     <w:p>
-      <w:pPr>
-        <w:pStyle w:val="Heading1"/>
-      </w:pPr>
       <w:r>
-        <w:t>Исправление 6. Заключение — пункт 7</w:t>
+        <w:rPr>
+          <w:b/>
+          <w:sz w:val="24"/>
+        </w:rPr>
+        <w:t>Исправление 6</w:t>
+      </w:r>
+    </w:p>
+    <w:p>
+      <w:r>
+        <w:rPr>
+          <w:b/>
+        </w:rPr>
+        <w:t xml:space="preserve">Место: </w:t>
+      </w:r>
+      <w:r>
+        <w:t>Заключение — пункт 7</w:t>
       </w:r>
     </w:p>
     <w:p>
@@ -331,17 +341,11 @@
         <w:rPr>
           <w:b/>
         </w:rPr>
-        <w:t>Исходный текст:</w:t>
+        <w:t>Было:</w:t>
       </w:r>
     </w:p>
     <w:p>
-      <w:pPr>
-        <w:ind w:left="480"/>
-      </w:pPr>
       <w:r>
-        <w:rPr>
-          <w:color w:val="A00000"/>
-        </w:rPr>
         <w:t>7) написаны 39 автоматических тестов, охватывающих все API-эндпоинты и ключевую бизнес-логику; все тесты проходят успешно;</w:t>
       </w:r>
     </w:p>
@@ -350,17 +354,11 @@
         <w:rPr>
           <w:b/>
         </w:rPr>
-        <w:t>Исправленный текст:</w:t>
+        <w:t>Стало:</w:t>
       </w:r>
     </w:p>
     <w:p>
-      <w:pPr>
-        <w:ind w:left="480"/>
-      </w:pPr>
       <w:r>
-        <w:rPr>
-          <w:color w:val="006000"/>
-        </w:rPr>
         <w:t>7) написаны 68 автоматических тестов, охватывающих все API-эндпоинты и ключевую бизнес-логику; все тесты проходят успешно;</w:t>
       </w:r>
     </w:p>
@@ -738,6 +736,10 @@
     <w:name w:val="Normal"/>
     <w:qFormat/>
     <w:rsid w:val="00FC693F"/>
+    <w:rPr>
+      <w:rFonts w:ascii="Times New Roman" w:hAnsi="Times New Roman"/>
+      <w:sz w:val="24"/>
+    </w:rPr>
   </w:style>
   <w:style w:type="paragraph" w:styleId="Header">
     <w:name w:val="header"/>

</xml_diff>

<commit_message>
docs: update test count to 86 in pz_corrections (unit 21 + integration 51 + frontend 14)
https://claude.ai/code/session_01D3hkvTwHu9An1jnGPvHyaS
</commit_message>
<xml_diff>
--- a/docs/pz_corrections.docx
+++ b/docs/pz_corrections.docx
@@ -19,7 +19,6 @@
       <w:r>
         <w:rPr>
           <w:b/>
-          <w:sz w:val="24"/>
         </w:rPr>
         <w:t>Исправление 1</w:t>
       </w:r>
@@ -43,7 +42,7 @@
         <w:t xml:space="preserve">Причина: </w:t>
       </w:r>
       <w:r>
-        <w:t>Фактическая ошибка: test_integration.py содержит 51 тест, test_unit.py — 17, итого 68.</w:t>
+        <w:t>Фактическая ошибка: итоговое число тестов — 86 (unit: 21, integration: 51, frontend: 14), а не 39.</w:t>
       </w:r>
     </w:p>
     <w:p>
@@ -69,7 +68,7 @@
     </w:p>
     <w:p>
       <w:r>
-        <w:t>Бэкенд реализован на Django 5 и Django REST Framework, фронтенд — на React 19 с TypeScript. Написано 68 автоматических тестов для API и бизнес-логики. Приложение развёрнуто на VPS-сервере под управлением Debian 11.</w:t>
+        <w:t>Бэкенд реализован на Django 5 и Django REST Framework, фронтенд — на React 19 с TypeScript. Написано 86 автоматических тестов: 21 модульный, 51 интеграционный и 14 клиентских. Приложение развёрнуто на VPS-сервере под управлением Debian 11.</w:t>
       </w:r>
     </w:p>
     <w:p/>
@@ -77,7 +76,6 @@
       <w:r>
         <w:rPr>
           <w:b/>
-          <w:sz w:val="24"/>
         </w:rPr>
         <w:t>Исправление 2</w:t>
       </w:r>
@@ -135,7 +133,6 @@
       <w:r>
         <w:rPr>
           <w:b/>
-          <w:sz w:val="24"/>
         </w:rPr>
         <w:t>Исправление 3</w:t>
       </w:r>
@@ -193,7 +190,6 @@
       <w:r>
         <w:rPr>
           <w:b/>
-          <w:sz w:val="24"/>
         </w:rPr>
         <w:t>Исправление 4</w:t>
       </w:r>
@@ -251,7 +247,6 @@
       <w:r>
         <w:rPr>
           <w:b/>
-          <w:sz w:val="24"/>
         </w:rPr>
         <w:t>Исправление 5</w:t>
       </w:r>
@@ -275,7 +270,7 @@
         <w:t xml:space="preserve">Причина: </w:t>
       </w:r>
       <w:r>
-        <w:t>Фактическая ошибка в числе тестов: 51 интеграционный + 17 юнит = 68.</w:t>
+        <w:t>Фактическая ошибка в числе тестов: unit 21 + integration 51 + frontend 14 = 86.</w:t>
       </w:r>
     </w:p>
     <w:p>
@@ -301,7 +296,7 @@
     </w:p>
     <w:p>
       <w:r>
-        <w:t>Все 68 тестов проходят успешно. Время выполнения полного набора тестов составляет около 2 секунд.</w:t>
+        <w:t>Все 86 тестов проходят успешно: 21 модульный (test_unit.py), 51 интеграционный (test_integration.py) и 14 клиентских (Vitest). Время выполнения бэкенд-тестов составляет около 2 секунд.</w:t>
       </w:r>
     </w:p>
     <w:p/>
@@ -309,7 +304,6 @@
       <w:r>
         <w:rPr>
           <w:b/>
-          <w:sz w:val="24"/>
         </w:rPr>
         <w:t>Исправление 6</w:t>
       </w:r>
@@ -359,7 +353,7 @@
     </w:p>
     <w:p>
       <w:r>
-        <w:t>7) написаны 68 автоматических тестов, охватывающих все API-эндпоинты и ключевую бизнес-логику; все тесты проходят успешно;</w:t>
+        <w:t>7) написаны 86 автоматических тестов (21 модульный, 51 интеграционный, 14 клиентских), охватывающих все API-эндпоинты, ключевую бизнес-логику и компоненты пользовательского интерфейса; все тесты проходят успешно;</w:t>
       </w:r>
     </w:p>
     <w:p/>

</xml_diff>